<commit_message>
frontend changes to show nlp
</commit_message>
<xml_diff>
--- a/Weekly Log Book.docx
+++ b/Weekly Log Book.docx
@@ -313,22 +313,113 @@
         <w:t>27/02/2026 – Week 6</w:t>
       </w:r>
     </w:p>
+    <w:p>
+      <w:r>
+        <w:t>This week, I implemented the FAISS vector store that will power the semantic matching capabilities of the AI Career Advisor. I created a dedicated FAISS index for storing embeddings and added support for attaching metadata (such as resume IDs and job IDs) so that similarity results can be linked back to actual database entries. I also refined the preprocessing module, ensuring CV text is normalized before embedding.</w:t>
+      </w:r>
+    </w:p>
+    <w:p>
+      <w:r>
+        <w:t>Additionally, I began adding embedding support for job descriptions so the system can compare CV vectors to job posting vectors. This included preparing the backend functions that will generate embeddings for new job postings when recruiters upload them.</w:t>
+      </w:r>
+    </w:p>
     <w:p/>
     <w:p>
       <w:r>
         <w:t>06/03/2026 – Week 7</w:t>
       </w:r>
     </w:p>
+    <w:p>
+      <w:r>
+        <w:t>This week, I focused on completing the first end-to-end version of the semantic matching workflow. I added embedding generation for job postings and stored both CV and job embeddings inside the FAISS index with their associated metadata. I then began building the new match search endpoint that retrieves a resume’s embedding, performs a FAISS similarity search, and returns the top job matches.</w:t>
+      </w:r>
+    </w:p>
+    <w:p>
+      <w:r>
+        <w:t>I also reviewed how match results will be displayed on the job seeker dashboard and designed a clear data structure for returning job metadata, descriptions, and similarity scores to the frontend. This will allow me to fully implement the comparison viewer next.</w:t>
+      </w:r>
+    </w:p>
     <w:p/>
     <w:p>
       <w:r>
         <w:t>13/03/2026 – Week 8</w:t>
       </w:r>
     </w:p>
+    <w:p>
+      <w:r>
+        <w:t xml:space="preserve">This week, I expanded the functionality of the AI Career Advisor by beginning work on two new features: </w:t>
+      </w:r>
+      <w:r>
+        <w:rPr>
+          <w:b/>
+          <w:bCs/>
+        </w:rPr>
+        <w:t>resume improvement suggestions</w:t>
+      </w:r>
+      <w:r>
+        <w:t xml:space="preserve"> and </w:t>
+      </w:r>
+      <w:r>
+        <w:rPr>
+          <w:b/>
+          <w:bCs/>
+        </w:rPr>
+        <w:t>missing skills highlighting</w:t>
+      </w:r>
+      <w:r>
+        <w:t>. Based on feedback and the project requirements, I designed a simple NLP-driven rules system that compares the extracted CV content with the extracted job requirements to identify skills the candidate may be missing. I also drafted the logic for generating improvement tips, such as recommending specific keywords, skill phrasing, or formatting adjustments.</w:t>
+      </w:r>
+    </w:p>
+    <w:p>
+      <w:r>
+        <w:lastRenderedPageBreak/>
+        <w:t>Alongside these features, I continued developing the matching pipeline. I completed the backend logic that retrieves resume embeddings, performs FAISS similarity search, and structures match results, including similarity scores and job metadata. I also prepared the frontend selector interface for comparing a CV to multiple job postings.</w:t>
+      </w:r>
+    </w:p>
+    <w:p>
+      <w:r>
+        <w:t>To support more realistic testing, I started collecting sample job postings and datasets that will be used for evaluating match quality and improvement suggestions. Next week, I plan to integrate missing-skills highlighting directly into the comparison viewer, finish the resume improvement system, and complete the final version of the job seeker dashboard.</w:t>
+      </w:r>
+    </w:p>
     <w:p/>
     <w:p>
       <w:r>
         <w:t>20/03/2026 – Week 9</w:t>
+      </w:r>
+    </w:p>
+    <w:p>
+      <w:r>
+        <w:t xml:space="preserve">This week, I expanded the functionality of the AI Career Advisor by beginning work on two new features: </w:t>
+      </w:r>
+      <w:r>
+        <w:rPr>
+          <w:b/>
+          <w:bCs/>
+        </w:rPr>
+        <w:t>resume improvement suggestions</w:t>
+      </w:r>
+      <w:r>
+        <w:t xml:space="preserve"> and </w:t>
+      </w:r>
+      <w:r>
+        <w:rPr>
+          <w:b/>
+          <w:bCs/>
+        </w:rPr>
+        <w:t>missing skills highlighting</w:t>
+      </w:r>
+      <w:r>
+        <w:t>. Based on feedback and the project requirements, I designed a simple NLP-driven rules system that compares the extracted CV content with the extracted job requirements to identify skills the candidate may be missing. I also drafted the logic for generating improvement tips, such as recommending specific keywords, skill phrasing, or formatting adjustments.</w:t>
+      </w:r>
+    </w:p>
+    <w:p>
+      <w:r>
+        <w:t>Alongside these features, I continued developing the matching pipeline. I completed the backend logic that retrieves resume embeddings, performs FAISS similarity search, and structures match results, including similarity scores and job metadata. I also prepared the frontend selector interface for comparing a CV to multiple job postings.</w:t>
+      </w:r>
+    </w:p>
+    <w:p>
+      <w:r>
+        <w:t>To support more realistic testing, I started collecting sample job postings and datasets that will be used for evaluating match quality and improvement suggestions. Next week, I plan to integrate missing-skills highlighting directly into the comparison viewer, finish the resume improvement system, and complete the final version of the job seeker dashboard.</w:t>
       </w:r>
     </w:p>
     <w:p/>

</xml_diff>